<commit_message>
Sesión 16: la Parte B del examen pasa a ser la presentación del proyecto integrador
- Examen Final [EF]: cuestionario en el Aula Virtual (10) y presentación de 7 minutos (10),
  con la entrega previa del proyecto y la bitácora de prompts
- EF_Parte_B_Pauta_de_Presentacion.pdf: guion de 5 minutos, preguntas posibles y rúbrica
- Diapositivas y guía de estudio de la sesión 16 al día; planilla de calificación del docente
- Sesión 15: la entrega del proyecto suma la bitácora de prompts y se revisa al presentarlo
- Se retiran la ficha técnica y la solución del caso práctico anterior

Co-Authored-By: Claude Opus 5.5 <noreply@anthropic.com>
Claude-Session: https://claude.ai/code/session_01DTMfh1taM2E7eRrYoW6GSd
</commit_message>
<xml_diff>
--- a/SESION 16/Examen Final [EF].docx
+++ b/SESION 16/Examen Final [EF].docx
@@ -219,7 +219,7 @@
         <w:rPr>
           <w:sz w:val="24"/>
         </w:rPr>
-        <w:t>Virtual</w:t>
+        <w:t>Clase sincrónica</w:t>
       </w:r>
       <w:r>
         <w:rPr>
@@ -233,7 +233,7 @@
           <w:spacing w:val="-2"/>
           <w:sz w:val="24"/>
         </w:rPr>
-        <w:t>(Aula Virtual USS)</w:t>
+        <w:t>y Aula Virtual USS</w:t>
       </w:r>
       <w:r>
         <w:rPr>
@@ -420,7 +420,7 @@
           <w:spacing w:val="-2"/>
           <w:sz w:val="24"/>
         </w:rPr>
-        <w:t xml:space="preserve">2 horas </w:t>
+        <w:t xml:space="preserve">4 horas (toda la sesión) </w:t>
       </w:r>
     </w:p>
     <w:p>
@@ -643,27 +643,27 @@
         <w:t xml:space="preserve">individual</w:t>
       </w:r>
       <w:r>
-        <w:t xml:space="preserve"> y se rinde en el </w:t>
+        <w:t xml:space="preserve"> y se rinde el </w:t>
       </w:r>
       <w:r>
         <w:rPr>
           <w:b/>
           <w:bCs/>
         </w:rPr>
+        <w:t xml:space="preserve">jueves 05/11/2026</w:t>
+      </w:r>
+      <w:r>
+        <w:t xml:space="preserve">, en el horario de clase: el cuestionario en el </w:t>
+      </w:r>
+      <w:r>
+        <w:rPr>
+          <w:b/>
+          <w:bCs/>
+        </w:rPr>
         <w:t xml:space="preserve">Aula Virtual USS</w:t>
       </w:r>
       <w:r>
-        <w:t xml:space="preserve"> el </w:t>
-      </w:r>
-      <w:r>
-        <w:rPr>
-          <w:b/>
-          <w:bCs/>
-        </w:rPr>
-        <w:t xml:space="preserve">jueves 05/11/2026</w:t>
-      </w:r>
-      <w:r>
-        <w:t xml:space="preserve">, en el horario de clase.</w:t>
+        <w:t xml:space="preserve"> y la presentación en la clase.</w:t>
       </w:r>
     </w:p>
     <w:p>
@@ -717,30 +717,10 @@
           <w:b/>
           <w:bCs/>
         </w:rPr>
-        <w:t xml:space="preserve">Parte B · Caso práctico (10 puntos, 80 minutos):</w:t>
-      </w:r>
-      <w:r>
-        <w:t xml:space="preserve"> construir la página </w:t>
-      </w:r>
-      <w:r>
-        <w:rPr>
-          <w:i/>
-          <w:iCs/>
-        </w:rPr>
-        <w:t xml:space="preserve">Semana de la Informática 2026</w:t>
-      </w:r>
-      <w:r>
-        <w:t xml:space="preserve"> según la </w:t>
-      </w:r>
-      <w:r>
-        <w:rPr>
-          <w:b/>
-          <w:bCs/>
-        </w:rPr>
-        <w:t xml:space="preserve">ficha técnica</w:t>
-      </w:r>
-      <w:r>
-        <w:t xml:space="preserve"> publicada en el Aula Virtual, con HTML semántico, CSS externo y diseño adaptable.</w:t>
+        <w:t xml:space="preserve">Parte B · Presentación del proyecto integrador (10 puntos, 7 minutos por estudiante):</w:t>
+      </w:r>
+      <w:r>
+        <w:t xml:space="preserve"> 5 minutos para presentar el portafolio publicado, su diseño en Figma y el uso de la IA, y 2 minutos de preguntas.</w:t>
       </w:r>
     </w:p>
     <w:p>
@@ -756,61 +736,17 @@
           <w:b/>
           <w:bCs/>
         </w:rPr>
-        <w:t xml:space="preserve">Requisitos de la Parte B:</w:t>
-      </w:r>
-      <w:r>
-        <w:t xml:space="preserve"> etiquetas semánticas, variables en </w:t>
-      </w:r>
-      <w:r>
-        <w:rPr>
-          <w:rStyle w:val="CdigoHTML"/>
-        </w:rPr>
-        <w:t xml:space="preserve">:root</w:t>
-      </w:r>
-      <w:r>
-        <w:t xml:space="preserve">, </w:t>
-      </w:r>
-      <w:r>
-        <w:rPr>
-          <w:rStyle w:val="CdigoHTML"/>
-        </w:rPr>
-        <w:t xml:space="preserve">grid</w:t>
-      </w:r>
-      <w:r>
-        <w:t xml:space="preserve"> o la grilla de Bootstrap, una media query para el celular, un </w:t>
-      </w:r>
-      <w:r>
-        <w:rPr>
-          <w:rStyle w:val="CdigoHTML"/>
-        </w:rPr>
-        <w:t xml:space="preserve">:hover</w:t>
-      </w:r>
-      <w:r>
-        <w:t xml:space="preserve"> con </w:t>
-      </w:r>
-      <w:r>
-        <w:rPr>
-          <w:rStyle w:val="CdigoHTML"/>
-        </w:rPr>
-        <w:t xml:space="preserve">transition</w:t>
-      </w:r>
-      <w:r>
-        <w:t xml:space="preserve"> y un formulario con </w:t>
-      </w:r>
-      <w:r>
-        <w:rPr>
-          <w:rStyle w:val="CdigoHTML"/>
-        </w:rPr>
-        <w:t xml:space="preserve">label</w:t>
-      </w:r>
-      <w:r>
-        <w:t xml:space="preserve"> y </w:t>
-      </w:r>
-      <w:r>
-        <w:rPr>
-          <w:rStyle w:val="CdigoHTML"/>
-        </w:rPr>
-        <w:t xml:space="preserve">required</w:t>
+        <w:t xml:space="preserve">Guion de la Parte B:</w:t>
+      </w:r>
+      <w:r>
+        <w:t xml:space="preserve"> presentación del sitio, diseño en Figma, recorrido por el sitio publicado (incluido el celular), el mejor prompt de la bitácora y la captura de Lighthouse. Ver la </w:t>
+      </w:r>
+      <w:r>
+        <w:rPr>
+          <w:b/>
+          <w:bCs/>
+        </w:rPr>
+        <w:t xml:space="preserve">pauta de presentación</w:t>
       </w:r>
       <w:r>
         <w:t xml:space="preserve">.</w:t>
@@ -829,37 +765,29 @@
           <w:b/>
           <w:bCs/>
         </w:rPr>
-        <w:t xml:space="preserve">Entrega de la Parte B:</w:t>
-      </w:r>
-      <w:r>
-        <w:t xml:space="preserve"> la carpeta comprimida </w:t>
+        <w:t xml:space="preserve">Entrega previa:</w:t>
+      </w:r>
+      <w:r>
+        <w:t xml:space="preserve"> antes de la sesión, subir a la tarea </w:t>
+      </w:r>
+      <w:r>
+        <w:rPr>
+          <w:b/>
+          <w:bCs/>
+        </w:rPr>
+        <w:t xml:space="preserve">Proyecto integrador</w:t>
+      </w:r>
+      <w:r>
+        <w:t xml:space="preserve"> la dirección de Netlify, el enlace de Figma, la carpeta </w:t>
       </w:r>
       <w:r>
         <w:rPr>
           <w:rStyle w:val="CdigoHTML"/>
         </w:rPr>
-        <w:t xml:space="preserve">apellido-nombre-ef.zip</w:t>
-      </w:r>
-      <w:r>
-        <w:t xml:space="preserve">, con </w:t>
-      </w:r>
-      <w:r>
-        <w:rPr>
-          <w:rStyle w:val="CdigoHTML"/>
-        </w:rPr>
-        <w:t xml:space="preserve">index.html</w:t>
-      </w:r>
-      <w:r>
-        <w:t xml:space="preserve"> y </w:t>
-      </w:r>
-      <w:r>
-        <w:rPr>
-          <w:rStyle w:val="CdigoHTML"/>
-        </w:rPr>
-        <w:t xml:space="preserve">assets/css/estilos.css</w:t>
-      </w:r>
-      <w:r>
-        <w:t xml:space="preserve">, en la tarea del Aula Virtual.</w:t>
+        <w:t xml:space="preserve">apellido-nombre-portafolio.zip</w:t>
+      </w:r>
+      <w:r>
+        <w:t xml:space="preserve">, la captura de Lighthouse y la bitácora de prompts.</w:t>
       </w:r>
     </w:p>
     <w:p>
@@ -875,10 +803,10 @@
           <w:b/>
           <w:bCs/>
         </w:rPr>
-        <w:t xml:space="preserve">Materiales permitidos:</w:t>
-      </w:r>
-      <w:r>
-        <w:t xml:space="preserve"> su portafolio, las guías del curso, MDN y getbootstrap.com. Para repasar: el </w:t>
+        <w:t xml:space="preserve">Materiales permitidos en la Parte A:</w:t>
+      </w:r>
+      <w:r>
+        <w:t xml:space="preserve"> ninguno; el cuestionario es individual y sin consulta. Para repasar: la guía de estudio y el </w:t>
       </w:r>
       <w:r>
         <w:rPr>
@@ -919,7 +847,7 @@
         <w:t xml:space="preserve">Conexión:</w:t>
       </w:r>
       <w:r>
-        <w:t xml:space="preserve"> Ingrese al Aula Virtual 10 minutos antes. Cada parte se cierra a la hora indicada, aunque no haya terminado.</w:t>
+        <w:t xml:space="preserve"> Ingrese al Aula Virtual 10 minutos antes. El cuestionario se cierra a la hora indicada, aunque no haya terminado.</w:t>
       </w:r>
     </w:p>
     <w:p>
@@ -938,7 +866,16 @@
         <w:t xml:space="preserve">Problemas técnicos:</w:t>
       </w:r>
       <w:r>
-        <w:t xml:space="preserve"> Si se corta la conexión, vuelva a ingresar: el cuestionario conserva las respuestas guardadas. Avise al docente de inmediato.</w:t>
+        <w:t xml:space="preserve"> Si se corta la conexión, vuelva a ingresar: el cuestionario conserva las respuestas guardadas. Si su sitio no abre al presentar, presente desde la carpeta </w:t>
+      </w:r>
+      <w:r>
+        <w:rPr>
+          <w:rStyle w:val="CdigoHTML"/>
+        </w:rPr>
+        <w:t xml:space="preserve">.zip</w:t>
+      </w:r>
+      <w:r>
+        <w:t xml:space="preserve">.</w:t>
       </w:r>
     </w:p>
     <w:p>
@@ -957,7 +894,7 @@
         <w:t xml:space="preserve">Originalidad:</w:t>
       </w:r>
       <w:r>
-        <w:t xml:space="preserve"> El examen es individual. Los trabajos iguales entre sí o elaborados por terceros se califican con cero.</w:t>
+        <w:t xml:space="preserve"> Puede usar IA en su proyecto si la registra en la bitácora y explica su código. Los trabajos iguales entre sí o elaborados por terceros se califican con cero.</w:t>
       </w:r>
     </w:p>
     <w:p>
@@ -1320,7 +1257,7 @@
                 <w:b/>
                 <w:bCs/>
               </w:rPr>
-              <w:t xml:space="preserve">Estructura semántica</w:t>
+              <w:t xml:space="preserve">Sitio publicado y funcional</w:t>
             </w:r>
           </w:p>
         </w:tc>
@@ -1336,74 +1273,7 @@
               </w:rPr>
             </w:pPr>
             <w:r>
-              <w:rPr>
-                <w:rStyle w:val="CdigoHTML"/>
-                <w:rFonts w:eastAsia="Calibri"/>
-              </w:rPr>
-              <w:t xml:space="preserve">header</w:t>
-            </w:r>
-            <w:r>
-              <w:t xml:space="preserve">, </w:t>
-            </w:r>
-            <w:r>
-              <w:rPr>
-                <w:rStyle w:val="CdigoHTML"/>
-                <w:rFonts w:eastAsia="Calibri"/>
-              </w:rPr>
-              <w:t xml:space="preserve">nav</w:t>
-            </w:r>
-            <w:r>
-              <w:t xml:space="preserve">, </w:t>
-            </w:r>
-            <w:r>
-              <w:rPr>
-                <w:rStyle w:val="CdigoHTML"/>
-                <w:rFonts w:eastAsia="Calibri"/>
-              </w:rPr>
-              <w:t xml:space="preserve">main</w:t>
-            </w:r>
-            <w:r>
-              <w:t xml:space="preserve">, </w:t>
-            </w:r>
-            <w:r>
-              <w:rPr>
-                <w:rStyle w:val="CdigoHTML"/>
-                <w:rFonts w:eastAsia="Calibri"/>
-              </w:rPr>
-              <w:t xml:space="preserve">section</w:t>
-            </w:r>
-            <w:r>
-              <w:t xml:space="preserve">, </w:t>
-            </w:r>
-            <w:r>
-              <w:rPr>
-                <w:rStyle w:val="CdigoHTML"/>
-                <w:rFonts w:eastAsia="Calibri"/>
-              </w:rPr>
-              <w:t xml:space="preserve">article</w:t>
-            </w:r>
-            <w:r>
-              <w:t xml:space="preserve"> y </w:t>
-            </w:r>
-            <w:r>
-              <w:rPr>
-                <w:rStyle w:val="CdigoHTML"/>
-                <w:rFonts w:eastAsia="Calibri"/>
-              </w:rPr>
-              <w:t xml:space="preserve">footer</w:t>
-            </w:r>
-            <w:r>
-              <w:t xml:space="preserve">; un solo </w:t>
-            </w:r>
-            <w:r>
-              <w:rPr>
-                <w:rStyle w:val="CdigoHTML"/>
-                <w:rFonts w:eastAsia="Calibri"/>
-              </w:rPr>
-              <w:t xml:space="preserve">h1</w:t>
-            </w:r>
-            <w:r>
-              <w:t xml:space="preserve">; HTML sin errores en el validador del W3C.</w:t>
+              <w:t xml:space="preserve">En Netlify, con los enlaces, el celular a 390 px, el formulario y la página 404 funcionando.</w:t>
             </w:r>
           </w:p>
         </w:tc>
@@ -1447,7 +1317,7 @@
                 <w:b/>
                 <w:bCs/>
               </w:rPr>
-              <w:t xml:space="preserve">Estilos y variables</w:t>
+              <w:t xml:space="preserve">Diseño y fidelidad</w:t>
             </w:r>
           </w:p>
         </w:tc>
@@ -1463,27 +1333,7 @@
               </w:rPr>
             </w:pPr>
             <w:r>
-              <w:t xml:space="preserve">CSS externo en </w:t>
-            </w:r>
-            <w:r>
-              <w:rPr>
-                <w:rStyle w:val="CdigoHTML"/>
-                <w:rFonts w:eastAsia="Calibri"/>
-              </w:rPr>
-              <w:t xml:space="preserve">assets/css/</w:t>
-            </w:r>
-            <w:r>
-              <w:t xml:space="preserve">, con los valores de la ficha técnica como variables en </w:t>
-            </w:r>
-            <w:r>
-              <w:rPr>
-                <w:rStyle w:val="CdigoHTML"/>
-                <w:rFonts w:eastAsia="Calibri"/>
-              </w:rPr>
-              <w:t xml:space="preserve">:root</w:t>
-            </w:r>
-            <w:r>
-              <w:t xml:space="preserve"> y las fuentes enlazadas.</w:t>
+              <w:t xml:space="preserve">Figma con escritorio, celular y componentes; el sitio respeta sus colores, letras y medidas.</w:t>
             </w:r>
           </w:p>
         </w:tc>
@@ -1530,7 +1380,7 @@
                 <w:b/>
                 <w:bCs/>
               </w:rPr>
-              <w:t xml:space="preserve">Maquetación</w:t>
+              <w:t xml:space="preserve">Código y pruebas</w:t>
             </w:r>
           </w:p>
         </w:tc>
@@ -1549,17 +1399,7 @@
               </w:rPr>
             </w:pPr>
             <w:r>
-              <w:t xml:space="preserve">Cabecera con Flexbox y charlas en </w:t>
-            </w:r>
-            <w:r>
-              <w:rPr>
-                <w:rStyle w:val="CdigoHTML"/>
-                <w:rFonts w:eastAsia="Calibri"/>
-              </w:rPr>
-              <w:t xml:space="preserve">grid</w:t>
-            </w:r>
-            <w:r>
-              <w:t xml:space="preserve"> o en la grilla de Bootstrap, con las medidas de la ficha técnica.</w:t>
+              <w:t xml:space="preserve">HTML semántico y válido; explica la parte del código que se le pide; Lighthouse de 90 o más en Accesibilidad.</w:t>
             </w:r>
           </w:p>
         </w:tc>
@@ -1612,7 +1452,7 @@
                 <w:b/>
                 <w:bCs/>
               </w:rPr>
-              <w:t xml:space="preserve">Diseño adaptable</w:t>
+              <w:t xml:space="preserve">Uso responsable de la IA</w:t>
             </w:r>
           </w:p>
         </w:tc>
@@ -1634,17 +1474,7 @@
               </w:rPr>
             </w:pPr>
             <w:r>
-              <w:t xml:space="preserve">Etiqueta </w:t>
-            </w:r>
-            <w:r>
-              <w:rPr>
-                <w:rStyle w:val="CdigoHTML"/>
-                <w:rFonts w:eastAsia="Calibri"/>
-              </w:rPr>
-              <w:t xml:space="preserve">viewport</w:t>
-            </w:r>
-            <w:r>
-              <w:t xml:space="preserve"> y una media query que pasa las charlas a una columna, sin barra horizontal a 390 px.</w:t>
+              <w:t xml:space="preserve">Bitácora con al menos 3 prompts: qué pidió, qué corrigió y cómo lo comprobó.</w:t>
             </w:r>
           </w:p>
         </w:tc>
@@ -1700,7 +1530,7 @@
                 <w:b/>
                 <w:bCs/>
               </w:rPr>
-              <w:t xml:space="preserve">Interacción y formulario</w:t>
+              <w:t xml:space="preserve">Presentación</w:t>
             </w:r>
           </w:p>
         </w:tc>
@@ -1722,57 +1552,7 @@
               </w:rPr>
             </w:pPr>
             <w:r>
-              <w:t xml:space="preserve">Hover con </w:t>
-            </w:r>
-            <w:r>
-              <w:rPr>
-                <w:rStyle w:val="CdigoHTML"/>
-                <w:rFonts w:eastAsia="Calibri"/>
-              </w:rPr>
-              <w:t xml:space="preserve">transition</w:t>
-            </w:r>
-            <w:r>
-              <w:t xml:space="preserve"> en el botón y en el menú; campos con </w:t>
-            </w:r>
-            <w:r>
-              <w:rPr>
-                <w:rStyle w:val="CdigoHTML"/>
-                <w:rFonts w:eastAsia="Calibri"/>
-              </w:rPr>
-              <w:t xml:space="preserve">label</w:t>
-            </w:r>
-            <w:r>
-              <w:t xml:space="preserve">, </w:t>
-            </w:r>
-            <w:r>
-              <w:rPr>
-                <w:rStyle w:val="CdigoHTML"/>
-                <w:rFonts w:eastAsia="Calibri"/>
-              </w:rPr>
-              <w:t xml:space="preserve">name</w:t>
-            </w:r>
-            <w:r>
-              <w:t xml:space="preserve"> y </w:t>
-            </w:r>
-            <w:r>
-              <w:rPr>
-                <w:rStyle w:val="CdigoHTML"/>
-                <w:rFonts w:eastAsia="Calibri"/>
-              </w:rPr>
-              <w:t xml:space="preserve">required</w:t>
-            </w:r>
-            <w:r>
-              <w:t xml:space="preserve">; </w:t>
-            </w:r>
-            <w:r>
-              <w:rPr>
-                <w:rStyle w:val="CdigoHTML"/>
-                <w:rFonts w:eastAsia="Calibri"/>
-              </w:rPr>
-              <w:t xml:space="preserve">type="email"</w:t>
-            </w:r>
-            <w:r>
-              <w:t xml:space="preserve"> en el correo.</w:t>
+              <w:t xml:space="preserve">Sigue el guion en 5 minutos, con orden y claridad, y responde las preguntas.</w:t>
             </w:r>
           </w:p>
         </w:tc>

</xml_diff>